<commit_message>
changes made to design doc
</commit_message>
<xml_diff>
--- a/documentation/design.docx
+++ b/documentation/design.docx
@@ -25,7 +25,13 @@
     </w:p>
     <w:p>
       <w:r>
-        <w:t xml:space="preserve">The backend will be managed via django’s framework, </w:t>
+        <w:t xml:space="preserve">The backend will be managed via </w:t>
+      </w:r>
+      <w:r>
+        <w:t>Django’s</w:t>
+      </w:r>
+      <w:r>
+        <w:t xml:space="preserve"> framework, </w:t>
       </w:r>
       <w:r>
         <w:t>which provides</w:t>

</xml_diff>

<commit_message>
Add artist accounts and account management
</commit_message>
<xml_diff>
--- a/documentation/design.docx
+++ b/documentation/design.docx
@@ -7,12 +7,29 @@
         <w:pStyle w:val="Heading1"/>
       </w:pPr>
       <w:r>
-        <w:t>Front end</w:t>
+        <w:t>Overview</w:t>
       </w:r>
     </w:p>
     <w:p>
       <w:r>
-        <w:t>Pass</w:t>
+        <w:t xml:space="preserve">This project aims to create a website that allows users to create and modify their own accounts and follow music artists. Artists will be allowed to create an artist account where they can upload information on their discography. </w:t>
+      </w:r>
+    </w:p>
+    <w:p>
+      <w:r>
+        <w:t xml:space="preserve">The programming languages used for the front end will be HTML, CSS and JavaScript. </w:t>
+      </w:r>
+      <w:r>
+        <w:t xml:space="preserve">Bootstrap will be used alongside custom CSS and JavaScript to make the process quicker and easier. </w:t>
+      </w:r>
+      <w:r>
+        <w:t xml:space="preserve">The backend will be managed </w:t>
+      </w:r>
+      <w:r>
+        <w:t>using Python and Django, which provide</w:t>
+      </w:r>
+      <w:r>
+        <w:t xml:space="preserve"> forms and views. These simplify the interaction between the user and the database.</w:t>
       </w:r>
     </w:p>
     <w:p>
@@ -20,33 +37,2657 @@
         <w:pStyle w:val="Heading1"/>
       </w:pPr>
       <w:r>
-        <w:t>Back end</w:t>
+        <w:t>Security</w:t>
       </w:r>
     </w:p>
     <w:p>
       <w:r>
-        <w:t xml:space="preserve">The backend will be managed via </w:t>
-      </w:r>
-      <w:r>
-        <w:t>Django’s</w:t>
-      </w:r>
-      <w:r>
-        <w:t xml:space="preserve"> framework, </w:t>
-      </w:r>
-      <w:r>
-        <w:t>which provides</w:t>
-      </w:r>
-      <w:r>
-        <w:t xml:space="preserve"> forms and views</w:t>
-      </w:r>
-      <w:r>
-        <w:t xml:space="preserve">. These simplify the interaction </w:t>
-      </w:r>
-      <w:r>
-        <w:t xml:space="preserve">with the database </w:t>
-      </w:r>
-      <w:r>
-        <w:t>and allow for efficient communication between the frontend and backend.</w:t>
+        <w:t>Accounts are password-protected, and using Django’s built-in User system, account passwords are hashed. Some webpages will also only allow signed-in accounts to view them. If an account is not signed in when attempting to view a page, it will redirect the user to the log-in page.</w:t>
+      </w:r>
+      <w:r>
+        <w:t xml:space="preserve"> </w:t>
+      </w:r>
+    </w:p>
+    <w:p>
+      <w:r>
+        <w:t>SQL injection is another risk within this website</w:t>
+      </w:r>
+      <w:r>
+        <w:t>.</w:t>
+      </w:r>
+      <w:r>
+        <w:t xml:space="preserve"> Django’s system is protected from SQL injection, according to </w:t>
+      </w:r>
+      <w:r>
+        <w:t>its</w:t>
+      </w:r>
+      <w:r>
+        <w:t xml:space="preserve"> documentation.</w:t>
+      </w:r>
+      <w:r>
+        <w:t xml:space="preserve"> </w:t>
+      </w:r>
+      <w:sdt>
+        <w:sdtPr>
+          <w:id w:val="849690500"/>
+          <w:citation/>
+        </w:sdtPr>
+        <w:sdtContent>
+          <w:r>
+            <w:fldChar w:fldCharType="begin"/>
+          </w:r>
+          <w:r>
+            <w:instrText xml:space="preserve"> CITATION Dja26 \l 2057 </w:instrText>
+          </w:r>
+          <w:r>
+            <w:fldChar w:fldCharType="separate"/>
+          </w:r>
+          <w:r>
+            <w:rPr>
+              <w:noProof/>
+            </w:rPr>
+            <w:t>(Django Software Foundation, 2026)</w:t>
+          </w:r>
+          <w:r>
+            <w:fldChar w:fldCharType="end"/>
+          </w:r>
+        </w:sdtContent>
+      </w:sdt>
+    </w:p>
+    <w:p>
+      <w:pPr>
+        <w:pStyle w:val="Heading1"/>
+      </w:pPr>
+      <w:r>
+        <w:t>Data dictionary</w:t>
+      </w:r>
+    </w:p>
+    <w:tbl>
+      <w:tblPr>
+        <w:tblStyle w:val="TableGrid"/>
+        <w:tblW w:w="0" w:type="auto"/>
+        <w:tblLook w:val="04A0" w:firstRow="1" w:lastRow="0" w:firstColumn="1" w:lastColumn="0" w:noHBand="0" w:noVBand="1"/>
+      </w:tblPr>
+      <w:tblGrid>
+        <w:gridCol w:w="1786"/>
+        <w:gridCol w:w="1780"/>
+        <w:gridCol w:w="1606"/>
+        <w:gridCol w:w="1477"/>
+        <w:gridCol w:w="1237"/>
+        <w:gridCol w:w="1130"/>
+      </w:tblGrid>
+      <w:tr>
+        <w:tc>
+          <w:tcPr>
+            <w:tcW w:w="9016" w:type="dxa"/>
+            <w:gridSpan w:val="6"/>
+          </w:tcPr>
+          <w:p>
+            <w:pPr>
+              <w:jc w:val="center"/>
+            </w:pPr>
+            <w:r>
+              <w:t>Profile</w:t>
+            </w:r>
+          </w:p>
+        </w:tc>
+      </w:tr>
+      <w:tr>
+        <w:tc>
+          <w:tcPr>
+            <w:tcW w:w="1786" w:type="dxa"/>
+          </w:tcPr>
+          <w:p>
+            <w:r>
+              <w:t>Attribute</w:t>
+            </w:r>
+          </w:p>
+        </w:tc>
+        <w:tc>
+          <w:tcPr>
+            <w:tcW w:w="1780" w:type="dxa"/>
+          </w:tcPr>
+          <w:p>
+            <w:r>
+              <w:t>Data type</w:t>
+            </w:r>
+          </w:p>
+        </w:tc>
+        <w:tc>
+          <w:tcPr>
+            <w:tcW w:w="1606" w:type="dxa"/>
+          </w:tcPr>
+          <w:p>
+            <w:r>
+              <w:t>Format</w:t>
+            </w:r>
+          </w:p>
+        </w:tc>
+        <w:tc>
+          <w:tcPr>
+            <w:tcW w:w="1477" w:type="dxa"/>
+          </w:tcPr>
+          <w:p>
+            <w:r>
+              <w:t>Required</w:t>
+            </w:r>
+          </w:p>
+        </w:tc>
+        <w:tc>
+          <w:tcPr>
+            <w:tcW w:w="1237" w:type="dxa"/>
+          </w:tcPr>
+          <w:p>
+            <w:r>
+              <w:t>PK or FK</w:t>
+            </w:r>
+          </w:p>
+        </w:tc>
+        <w:tc>
+          <w:tcPr>
+            <w:tcW w:w="1130" w:type="dxa"/>
+          </w:tcPr>
+          <w:p>
+            <w:r>
+              <w:t>FK table</w:t>
+            </w:r>
+          </w:p>
+        </w:tc>
+      </w:tr>
+      <w:tr>
+        <w:tc>
+          <w:tcPr>
+            <w:tcW w:w="1786" w:type="dxa"/>
+          </w:tcPr>
+          <w:p>
+            <w:r>
+              <w:t>User</w:t>
+            </w:r>
+          </w:p>
+        </w:tc>
+        <w:tc>
+          <w:tcPr>
+            <w:tcW w:w="1780" w:type="dxa"/>
+          </w:tcPr>
+          <w:p>
+            <w:r>
+              <w:t>User</w:t>
+            </w:r>
+          </w:p>
+        </w:tc>
+        <w:tc>
+          <w:tcPr>
+            <w:tcW w:w="1606" w:type="dxa"/>
+          </w:tcPr>
+          <w:p/>
+        </w:tc>
+        <w:tc>
+          <w:tcPr>
+            <w:tcW w:w="1477" w:type="dxa"/>
+          </w:tcPr>
+          <w:p>
+            <w:r>
+              <w:t>YES</w:t>
+            </w:r>
+          </w:p>
+        </w:tc>
+        <w:tc>
+          <w:tcPr>
+            <w:tcW w:w="1237" w:type="dxa"/>
+          </w:tcPr>
+          <w:p>
+            <w:r>
+              <w:t>PK</w:t>
+            </w:r>
+          </w:p>
+        </w:tc>
+        <w:tc>
+          <w:tcPr>
+            <w:tcW w:w="1130" w:type="dxa"/>
+          </w:tcPr>
+          <w:p/>
+        </w:tc>
+      </w:tr>
+      <w:tr>
+        <w:tc>
+          <w:tcPr>
+            <w:tcW w:w="1786" w:type="dxa"/>
+          </w:tcPr>
+          <w:p>
+            <w:proofErr w:type="spellStart"/>
+            <w:r>
+              <w:t>Account_name</w:t>
+            </w:r>
+            <w:proofErr w:type="spellEnd"/>
+          </w:p>
+        </w:tc>
+        <w:tc>
+          <w:tcPr>
+            <w:tcW w:w="1780" w:type="dxa"/>
+          </w:tcPr>
+          <w:p>
+            <w:proofErr w:type="gramStart"/>
+            <w:r>
+              <w:t>VARCHAR(</w:t>
+            </w:r>
+            <w:proofErr w:type="gramEnd"/>
+            <w:r>
+              <w:t>255)</w:t>
+            </w:r>
+          </w:p>
+        </w:tc>
+        <w:tc>
+          <w:tcPr>
+            <w:tcW w:w="1606" w:type="dxa"/>
+          </w:tcPr>
+          <w:p/>
+        </w:tc>
+        <w:tc>
+          <w:tcPr>
+            <w:tcW w:w="1477" w:type="dxa"/>
+          </w:tcPr>
+          <w:p>
+            <w:r>
+              <w:t>YES</w:t>
+            </w:r>
+          </w:p>
+        </w:tc>
+        <w:tc>
+          <w:tcPr>
+            <w:tcW w:w="1237" w:type="dxa"/>
+          </w:tcPr>
+          <w:p/>
+        </w:tc>
+        <w:tc>
+          <w:tcPr>
+            <w:tcW w:w="1130" w:type="dxa"/>
+          </w:tcPr>
+          <w:p/>
+        </w:tc>
+      </w:tr>
+      <w:tr>
+        <w:tc>
+          <w:tcPr>
+            <w:tcW w:w="1786" w:type="dxa"/>
+          </w:tcPr>
+          <w:p>
+            <w:r>
+              <w:t>DOB</w:t>
+            </w:r>
+          </w:p>
+        </w:tc>
+        <w:tc>
+          <w:tcPr>
+            <w:tcW w:w="1780" w:type="dxa"/>
+          </w:tcPr>
+          <w:p>
+            <w:r>
+              <w:t>Date</w:t>
+            </w:r>
+          </w:p>
+        </w:tc>
+        <w:tc>
+          <w:tcPr>
+            <w:tcW w:w="1606" w:type="dxa"/>
+          </w:tcPr>
+          <w:p>
+            <w:r>
+              <w:t>DD-MM-YYYY</w:t>
+            </w:r>
+          </w:p>
+        </w:tc>
+        <w:tc>
+          <w:tcPr>
+            <w:tcW w:w="1477" w:type="dxa"/>
+          </w:tcPr>
+          <w:p>
+            <w:r>
+              <w:t>YES</w:t>
+            </w:r>
+          </w:p>
+        </w:tc>
+        <w:tc>
+          <w:tcPr>
+            <w:tcW w:w="1237" w:type="dxa"/>
+          </w:tcPr>
+          <w:p/>
+        </w:tc>
+        <w:tc>
+          <w:tcPr>
+            <w:tcW w:w="1130" w:type="dxa"/>
+          </w:tcPr>
+          <w:p/>
+        </w:tc>
+      </w:tr>
+      <w:tr>
+        <w:tc>
+          <w:tcPr>
+            <w:tcW w:w="1786" w:type="dxa"/>
+          </w:tcPr>
+          <w:p>
+            <w:proofErr w:type="spellStart"/>
+            <w:r>
+              <w:t>Profile_image</w:t>
+            </w:r>
+            <w:proofErr w:type="spellEnd"/>
+          </w:p>
+        </w:tc>
+        <w:tc>
+          <w:tcPr>
+            <w:tcW w:w="1780" w:type="dxa"/>
+          </w:tcPr>
+          <w:p>
+            <w:r>
+              <w:t>IMAGE</w:t>
+            </w:r>
+          </w:p>
+        </w:tc>
+        <w:tc>
+          <w:tcPr>
+            <w:tcW w:w="1606" w:type="dxa"/>
+          </w:tcPr>
+          <w:p/>
+        </w:tc>
+        <w:tc>
+          <w:tcPr>
+            <w:tcW w:w="1477" w:type="dxa"/>
+          </w:tcPr>
+          <w:p>
+            <w:r>
+              <w:t>NO</w:t>
+            </w:r>
+          </w:p>
+        </w:tc>
+        <w:tc>
+          <w:tcPr>
+            <w:tcW w:w="1237" w:type="dxa"/>
+          </w:tcPr>
+          <w:p/>
+        </w:tc>
+        <w:tc>
+          <w:tcPr>
+            <w:tcW w:w="1130" w:type="dxa"/>
+          </w:tcPr>
+          <w:p/>
+        </w:tc>
+      </w:tr>
+    </w:tbl>
+    <w:p/>
+    <w:tbl>
+      <w:tblPr>
+        <w:tblStyle w:val="TableGrid"/>
+        <w:tblW w:w="0" w:type="auto"/>
+        <w:tblLook w:val="04A0" w:firstRow="1" w:lastRow="0" w:firstColumn="1" w:lastColumn="0" w:noHBand="0" w:noVBand="1"/>
+      </w:tblPr>
+      <w:tblGrid>
+        <w:gridCol w:w="1696"/>
+        <w:gridCol w:w="1843"/>
+        <w:gridCol w:w="1701"/>
+        <w:gridCol w:w="1418"/>
+        <w:gridCol w:w="1275"/>
+        <w:gridCol w:w="1083"/>
+      </w:tblGrid>
+      <w:tr>
+        <w:tc>
+          <w:tcPr>
+            <w:tcW w:w="9016" w:type="dxa"/>
+            <w:gridSpan w:val="6"/>
+          </w:tcPr>
+          <w:p>
+            <w:pPr>
+              <w:jc w:val="center"/>
+            </w:pPr>
+            <w:r>
+              <w:t>Follower</w:t>
+            </w:r>
+          </w:p>
+        </w:tc>
+      </w:tr>
+      <w:tr>
+        <w:tc>
+          <w:tcPr>
+            <w:tcW w:w="1696" w:type="dxa"/>
+          </w:tcPr>
+          <w:p>
+            <w:r>
+              <w:t>Attribute</w:t>
+            </w:r>
+          </w:p>
+        </w:tc>
+        <w:tc>
+          <w:tcPr>
+            <w:tcW w:w="1843" w:type="dxa"/>
+          </w:tcPr>
+          <w:p>
+            <w:r>
+              <w:t>Data type</w:t>
+            </w:r>
+          </w:p>
+        </w:tc>
+        <w:tc>
+          <w:tcPr>
+            <w:tcW w:w="1701" w:type="dxa"/>
+          </w:tcPr>
+          <w:p>
+            <w:r>
+              <w:t>Format</w:t>
+            </w:r>
+          </w:p>
+        </w:tc>
+        <w:tc>
+          <w:tcPr>
+            <w:tcW w:w="1418" w:type="dxa"/>
+          </w:tcPr>
+          <w:p>
+            <w:r>
+              <w:t>Required</w:t>
+            </w:r>
+          </w:p>
+        </w:tc>
+        <w:tc>
+          <w:tcPr>
+            <w:tcW w:w="1275" w:type="dxa"/>
+          </w:tcPr>
+          <w:p>
+            <w:r>
+              <w:t>PK or FK</w:t>
+            </w:r>
+          </w:p>
+        </w:tc>
+        <w:tc>
+          <w:tcPr>
+            <w:tcW w:w="1083" w:type="dxa"/>
+          </w:tcPr>
+          <w:p>
+            <w:r>
+              <w:t>FK table</w:t>
+            </w:r>
+          </w:p>
+        </w:tc>
+      </w:tr>
+      <w:tr>
+        <w:tc>
+          <w:tcPr>
+            <w:tcW w:w="1696" w:type="dxa"/>
+          </w:tcPr>
+          <w:p>
+            <w:proofErr w:type="spellStart"/>
+            <w:r>
+              <w:t>Artist_ID</w:t>
+            </w:r>
+            <w:proofErr w:type="spellEnd"/>
+          </w:p>
+        </w:tc>
+        <w:tc>
+          <w:tcPr>
+            <w:tcW w:w="1843" w:type="dxa"/>
+          </w:tcPr>
+          <w:p>
+            <w:r>
+              <w:t>INT</w:t>
+            </w:r>
+          </w:p>
+        </w:tc>
+        <w:tc>
+          <w:tcPr>
+            <w:tcW w:w="1701" w:type="dxa"/>
+          </w:tcPr>
+          <w:p/>
+        </w:tc>
+        <w:tc>
+          <w:tcPr>
+            <w:tcW w:w="1418" w:type="dxa"/>
+          </w:tcPr>
+          <w:p>
+            <w:r>
+              <w:t>YES</w:t>
+            </w:r>
+          </w:p>
+        </w:tc>
+        <w:tc>
+          <w:tcPr>
+            <w:tcW w:w="1275" w:type="dxa"/>
+          </w:tcPr>
+          <w:p>
+            <w:r>
+              <w:t>PK</w:t>
+            </w:r>
+          </w:p>
+        </w:tc>
+        <w:tc>
+          <w:tcPr>
+            <w:tcW w:w="1083" w:type="dxa"/>
+          </w:tcPr>
+          <w:p/>
+        </w:tc>
+      </w:tr>
+      <w:tr>
+        <w:tc>
+          <w:tcPr>
+            <w:tcW w:w="1696" w:type="dxa"/>
+          </w:tcPr>
+          <w:p>
+            <w:r>
+              <w:t>User</w:t>
+            </w:r>
+          </w:p>
+        </w:tc>
+        <w:tc>
+          <w:tcPr>
+            <w:tcW w:w="1843" w:type="dxa"/>
+          </w:tcPr>
+          <w:p>
+            <w:r>
+              <w:t>User</w:t>
+            </w:r>
+          </w:p>
+        </w:tc>
+        <w:tc>
+          <w:tcPr>
+            <w:tcW w:w="1701" w:type="dxa"/>
+          </w:tcPr>
+          <w:p/>
+        </w:tc>
+        <w:tc>
+          <w:tcPr>
+            <w:tcW w:w="1418" w:type="dxa"/>
+          </w:tcPr>
+          <w:p>
+            <w:r>
+              <w:t>YES</w:t>
+            </w:r>
+          </w:p>
+        </w:tc>
+        <w:tc>
+          <w:tcPr>
+            <w:tcW w:w="1275" w:type="dxa"/>
+          </w:tcPr>
+          <w:p>
+            <w:r>
+              <w:t>FK</w:t>
+            </w:r>
+          </w:p>
+        </w:tc>
+        <w:tc>
+          <w:tcPr>
+            <w:tcW w:w="1083" w:type="dxa"/>
+          </w:tcPr>
+          <w:p>
+            <w:r>
+              <w:t>Profile</w:t>
+            </w:r>
+          </w:p>
+        </w:tc>
+      </w:tr>
+      <w:tr>
+        <w:tc>
+          <w:tcPr>
+            <w:tcW w:w="1696" w:type="dxa"/>
+          </w:tcPr>
+          <w:p>
+            <w:proofErr w:type="spellStart"/>
+            <w:r>
+              <w:t>Artist_user_ID</w:t>
+            </w:r>
+            <w:proofErr w:type="spellEnd"/>
+          </w:p>
+        </w:tc>
+        <w:tc>
+          <w:tcPr>
+            <w:tcW w:w="1843" w:type="dxa"/>
+          </w:tcPr>
+          <w:p>
+            <w:r>
+              <w:t>Composite key</w:t>
+            </w:r>
+          </w:p>
+        </w:tc>
+        <w:tc>
+          <w:tcPr>
+            <w:tcW w:w="1701" w:type="dxa"/>
+          </w:tcPr>
+          <w:p/>
+        </w:tc>
+        <w:tc>
+          <w:tcPr>
+            <w:tcW w:w="1418" w:type="dxa"/>
+          </w:tcPr>
+          <w:p>
+            <w:r>
+              <w:t>YES</w:t>
+            </w:r>
+          </w:p>
+        </w:tc>
+        <w:tc>
+          <w:tcPr>
+            <w:tcW w:w="1275" w:type="dxa"/>
+          </w:tcPr>
+          <w:p>
+            <w:r>
+              <w:t>PK</w:t>
+            </w:r>
+          </w:p>
+        </w:tc>
+        <w:tc>
+          <w:tcPr>
+            <w:tcW w:w="1083" w:type="dxa"/>
+          </w:tcPr>
+          <w:p/>
+        </w:tc>
+      </w:tr>
+    </w:tbl>
+    <w:p/>
+    <w:tbl>
+      <w:tblPr>
+        <w:tblStyle w:val="TableGrid"/>
+        <w:tblW w:w="0" w:type="auto"/>
+        <w:tblLook w:val="04A0" w:firstRow="1" w:lastRow="0" w:firstColumn="1" w:lastColumn="0" w:noHBand="0" w:noVBand="1"/>
+      </w:tblPr>
+      <w:tblGrid>
+        <w:gridCol w:w="1508"/>
+        <w:gridCol w:w="1780"/>
+        <w:gridCol w:w="1188"/>
+        <w:gridCol w:w="1963"/>
+        <w:gridCol w:w="1288"/>
+        <w:gridCol w:w="1289"/>
+      </w:tblGrid>
+      <w:tr>
+        <w:tc>
+          <w:tcPr>
+            <w:tcW w:w="9016" w:type="dxa"/>
+            <w:gridSpan w:val="6"/>
+          </w:tcPr>
+          <w:p>
+            <w:pPr>
+              <w:jc w:val="center"/>
+            </w:pPr>
+            <w:r>
+              <w:t>Artist</w:t>
+            </w:r>
+          </w:p>
+        </w:tc>
+      </w:tr>
+      <w:tr>
+        <w:tc>
+          <w:tcPr>
+            <w:tcW w:w="1388" w:type="dxa"/>
+          </w:tcPr>
+          <w:p>
+            <w:r>
+              <w:t>Attribute</w:t>
+            </w:r>
+          </w:p>
+        </w:tc>
+        <w:tc>
+          <w:tcPr>
+            <w:tcW w:w="1076" w:type="dxa"/>
+          </w:tcPr>
+          <w:p>
+            <w:r>
+              <w:t>Data type</w:t>
+            </w:r>
+          </w:p>
+        </w:tc>
+        <w:tc>
+          <w:tcPr>
+            <w:tcW w:w="1267" w:type="dxa"/>
+          </w:tcPr>
+          <w:p>
+            <w:r>
+              <w:t>Format</w:t>
+            </w:r>
+          </w:p>
+        </w:tc>
+        <w:tc>
+          <w:tcPr>
+            <w:tcW w:w="2243" w:type="dxa"/>
+          </w:tcPr>
+          <w:p>
+            <w:r>
+              <w:t>Required</w:t>
+            </w:r>
+          </w:p>
+        </w:tc>
+        <w:tc>
+          <w:tcPr>
+            <w:tcW w:w="1564" w:type="dxa"/>
+          </w:tcPr>
+          <w:p>
+            <w:r>
+              <w:t>PK or FK</w:t>
+            </w:r>
+          </w:p>
+        </w:tc>
+        <w:tc>
+          <w:tcPr>
+            <w:tcW w:w="1478" w:type="dxa"/>
+          </w:tcPr>
+          <w:p>
+            <w:r>
+              <w:t>FK table</w:t>
+            </w:r>
+          </w:p>
+        </w:tc>
+      </w:tr>
+      <w:tr>
+        <w:tc>
+          <w:tcPr>
+            <w:tcW w:w="1388" w:type="dxa"/>
+          </w:tcPr>
+          <w:p>
+            <w:proofErr w:type="spellStart"/>
+            <w:r>
+              <w:t>Artist_ID</w:t>
+            </w:r>
+            <w:proofErr w:type="spellEnd"/>
+          </w:p>
+        </w:tc>
+        <w:tc>
+          <w:tcPr>
+            <w:tcW w:w="1076" w:type="dxa"/>
+          </w:tcPr>
+          <w:p>
+            <w:r>
+              <w:t>INT</w:t>
+            </w:r>
+          </w:p>
+        </w:tc>
+        <w:tc>
+          <w:tcPr>
+            <w:tcW w:w="1267" w:type="dxa"/>
+          </w:tcPr>
+          <w:p/>
+        </w:tc>
+        <w:tc>
+          <w:tcPr>
+            <w:tcW w:w="2243" w:type="dxa"/>
+          </w:tcPr>
+          <w:p>
+            <w:r>
+              <w:t>YES</w:t>
+            </w:r>
+          </w:p>
+        </w:tc>
+        <w:tc>
+          <w:tcPr>
+            <w:tcW w:w="1564" w:type="dxa"/>
+          </w:tcPr>
+          <w:p>
+            <w:r>
+              <w:t>PK</w:t>
+            </w:r>
+          </w:p>
+        </w:tc>
+        <w:tc>
+          <w:tcPr>
+            <w:tcW w:w="1478" w:type="dxa"/>
+          </w:tcPr>
+          <w:p/>
+        </w:tc>
+      </w:tr>
+      <w:tr>
+        <w:tc>
+          <w:tcPr>
+            <w:tcW w:w="1388" w:type="dxa"/>
+          </w:tcPr>
+          <w:p>
+            <w:proofErr w:type="spellStart"/>
+            <w:r>
+              <w:t>Artist_name</w:t>
+            </w:r>
+            <w:proofErr w:type="spellEnd"/>
+          </w:p>
+        </w:tc>
+        <w:tc>
+          <w:tcPr>
+            <w:tcW w:w="1076" w:type="dxa"/>
+          </w:tcPr>
+          <w:p>
+            <w:proofErr w:type="gramStart"/>
+            <w:r>
+              <w:t>VARCHAR(</w:t>
+            </w:r>
+            <w:proofErr w:type="gramEnd"/>
+            <w:r>
+              <w:t>255)</w:t>
+            </w:r>
+          </w:p>
+        </w:tc>
+        <w:tc>
+          <w:tcPr>
+            <w:tcW w:w="1267" w:type="dxa"/>
+          </w:tcPr>
+          <w:p/>
+        </w:tc>
+        <w:tc>
+          <w:tcPr>
+            <w:tcW w:w="2243" w:type="dxa"/>
+          </w:tcPr>
+          <w:p>
+            <w:r>
+              <w:t>YES</w:t>
+            </w:r>
+          </w:p>
+        </w:tc>
+        <w:tc>
+          <w:tcPr>
+            <w:tcW w:w="1564" w:type="dxa"/>
+          </w:tcPr>
+          <w:p/>
+        </w:tc>
+        <w:tc>
+          <w:tcPr>
+            <w:tcW w:w="1478" w:type="dxa"/>
+          </w:tcPr>
+          <w:p/>
+        </w:tc>
+      </w:tr>
+      <w:tr>
+        <w:tc>
+          <w:tcPr>
+            <w:tcW w:w="1388" w:type="dxa"/>
+          </w:tcPr>
+          <w:p>
+            <w:proofErr w:type="spellStart"/>
+            <w:r>
+              <w:lastRenderedPageBreak/>
+              <w:t>Artist_image</w:t>
+            </w:r>
+            <w:proofErr w:type="spellEnd"/>
+          </w:p>
+        </w:tc>
+        <w:tc>
+          <w:tcPr>
+            <w:tcW w:w="1076" w:type="dxa"/>
+          </w:tcPr>
+          <w:p>
+            <w:r>
+              <w:t>IMAGE</w:t>
+            </w:r>
+          </w:p>
+        </w:tc>
+        <w:tc>
+          <w:tcPr>
+            <w:tcW w:w="1267" w:type="dxa"/>
+          </w:tcPr>
+          <w:p/>
+        </w:tc>
+        <w:tc>
+          <w:tcPr>
+            <w:tcW w:w="2243" w:type="dxa"/>
+          </w:tcPr>
+          <w:p>
+            <w:r>
+              <w:t>NO</w:t>
+            </w:r>
+          </w:p>
+        </w:tc>
+        <w:tc>
+          <w:tcPr>
+            <w:tcW w:w="1564" w:type="dxa"/>
+          </w:tcPr>
+          <w:p/>
+        </w:tc>
+        <w:tc>
+          <w:tcPr>
+            <w:tcW w:w="1478" w:type="dxa"/>
+          </w:tcPr>
+          <w:p/>
+        </w:tc>
+      </w:tr>
+    </w:tbl>
+    <w:p/>
+    <w:tbl>
+      <w:tblPr>
+        <w:tblStyle w:val="TableGrid"/>
+        <w:tblW w:w="0" w:type="auto"/>
+        <w:tblLook w:val="04A0" w:firstRow="1" w:lastRow="0" w:firstColumn="1" w:lastColumn="0" w:noHBand="0" w:noVBand="1"/>
+      </w:tblPr>
+      <w:tblGrid>
+        <w:gridCol w:w="1796"/>
+        <w:gridCol w:w="1780"/>
+        <w:gridCol w:w="1177"/>
+        <w:gridCol w:w="1855"/>
+        <w:gridCol w:w="1183"/>
+        <w:gridCol w:w="1225"/>
+      </w:tblGrid>
+      <w:tr>
+        <w:tc>
+          <w:tcPr>
+            <w:tcW w:w="9016" w:type="dxa"/>
+            <w:gridSpan w:val="6"/>
+          </w:tcPr>
+          <w:p>
+            <w:pPr>
+              <w:jc w:val="center"/>
+            </w:pPr>
+            <w:proofErr w:type="spellStart"/>
+            <w:r>
+              <w:t>TrackArtist</w:t>
+            </w:r>
+            <w:proofErr w:type="spellEnd"/>
+          </w:p>
+        </w:tc>
+      </w:tr>
+      <w:tr>
+        <w:tc>
+          <w:tcPr>
+            <w:tcW w:w="1388" w:type="dxa"/>
+          </w:tcPr>
+          <w:p>
+            <w:r>
+              <w:t>Attribute</w:t>
+            </w:r>
+          </w:p>
+        </w:tc>
+        <w:tc>
+          <w:tcPr>
+            <w:tcW w:w="1076" w:type="dxa"/>
+          </w:tcPr>
+          <w:p>
+            <w:r>
+              <w:t>Data type</w:t>
+            </w:r>
+          </w:p>
+        </w:tc>
+        <w:tc>
+          <w:tcPr>
+            <w:tcW w:w="1267" w:type="dxa"/>
+          </w:tcPr>
+          <w:p>
+            <w:r>
+              <w:t>Format</w:t>
+            </w:r>
+          </w:p>
+        </w:tc>
+        <w:tc>
+          <w:tcPr>
+            <w:tcW w:w="2243" w:type="dxa"/>
+          </w:tcPr>
+          <w:p>
+            <w:r>
+              <w:t>Required</w:t>
+            </w:r>
+          </w:p>
+        </w:tc>
+        <w:tc>
+          <w:tcPr>
+            <w:tcW w:w="1564" w:type="dxa"/>
+          </w:tcPr>
+          <w:p>
+            <w:r>
+              <w:t>PK or FK</w:t>
+            </w:r>
+          </w:p>
+        </w:tc>
+        <w:tc>
+          <w:tcPr>
+            <w:tcW w:w="1478" w:type="dxa"/>
+          </w:tcPr>
+          <w:p>
+            <w:r>
+              <w:t>FK table</w:t>
+            </w:r>
+          </w:p>
+        </w:tc>
+      </w:tr>
+      <w:tr>
+        <w:tc>
+          <w:tcPr>
+            <w:tcW w:w="1388" w:type="dxa"/>
+          </w:tcPr>
+          <w:p>
+            <w:proofErr w:type="spellStart"/>
+            <w:r>
+              <w:t>Spotify_URL</w:t>
+            </w:r>
+            <w:proofErr w:type="spellEnd"/>
+          </w:p>
+        </w:tc>
+        <w:tc>
+          <w:tcPr>
+            <w:tcW w:w="1076" w:type="dxa"/>
+          </w:tcPr>
+          <w:p>
+            <w:proofErr w:type="gramStart"/>
+            <w:r>
+              <w:t>VARCHAR(</w:t>
+            </w:r>
+            <w:proofErr w:type="gramEnd"/>
+            <w:r>
+              <w:t>255)</w:t>
+            </w:r>
+          </w:p>
+        </w:tc>
+        <w:tc>
+          <w:tcPr>
+            <w:tcW w:w="1267" w:type="dxa"/>
+          </w:tcPr>
+          <w:p/>
+        </w:tc>
+        <w:tc>
+          <w:tcPr>
+            <w:tcW w:w="2243" w:type="dxa"/>
+          </w:tcPr>
+          <w:p>
+            <w:r>
+              <w:t>YES</w:t>
+            </w:r>
+          </w:p>
+        </w:tc>
+        <w:tc>
+          <w:tcPr>
+            <w:tcW w:w="1564" w:type="dxa"/>
+          </w:tcPr>
+          <w:p>
+            <w:r>
+              <w:t>FK</w:t>
+            </w:r>
+          </w:p>
+        </w:tc>
+        <w:tc>
+          <w:tcPr>
+            <w:tcW w:w="1478" w:type="dxa"/>
+          </w:tcPr>
+          <w:p>
+            <w:r>
+              <w:t>Track</w:t>
+            </w:r>
+          </w:p>
+        </w:tc>
+      </w:tr>
+      <w:tr>
+        <w:tc>
+          <w:tcPr>
+            <w:tcW w:w="1388" w:type="dxa"/>
+          </w:tcPr>
+          <w:p>
+            <w:proofErr w:type="spellStart"/>
+            <w:r>
+              <w:t>Artist_ID</w:t>
+            </w:r>
+            <w:proofErr w:type="spellEnd"/>
+          </w:p>
+        </w:tc>
+        <w:tc>
+          <w:tcPr>
+            <w:tcW w:w="1076" w:type="dxa"/>
+          </w:tcPr>
+          <w:p>
+            <w:r>
+              <w:t>INT</w:t>
+            </w:r>
+          </w:p>
+        </w:tc>
+        <w:tc>
+          <w:tcPr>
+            <w:tcW w:w="1267" w:type="dxa"/>
+          </w:tcPr>
+          <w:p/>
+        </w:tc>
+        <w:tc>
+          <w:tcPr>
+            <w:tcW w:w="2243" w:type="dxa"/>
+          </w:tcPr>
+          <w:p>
+            <w:r>
+              <w:t>YES</w:t>
+            </w:r>
+          </w:p>
+        </w:tc>
+        <w:tc>
+          <w:tcPr>
+            <w:tcW w:w="1564" w:type="dxa"/>
+          </w:tcPr>
+          <w:p>
+            <w:r>
+              <w:t>FK</w:t>
+            </w:r>
+          </w:p>
+        </w:tc>
+        <w:tc>
+          <w:tcPr>
+            <w:tcW w:w="1478" w:type="dxa"/>
+          </w:tcPr>
+          <w:p>
+            <w:r>
+              <w:t>Artist</w:t>
+            </w:r>
+          </w:p>
+        </w:tc>
+      </w:tr>
+      <w:tr>
+        <w:tc>
+          <w:tcPr>
+            <w:tcW w:w="1388" w:type="dxa"/>
+          </w:tcPr>
+          <w:p>
+            <w:r>
+              <w:t>Role</w:t>
+            </w:r>
+          </w:p>
+        </w:tc>
+        <w:tc>
+          <w:tcPr>
+            <w:tcW w:w="1076" w:type="dxa"/>
+          </w:tcPr>
+          <w:p>
+            <w:r>
+              <w:t>ENUM</w:t>
+            </w:r>
+          </w:p>
+        </w:tc>
+        <w:tc>
+          <w:tcPr>
+            <w:tcW w:w="1267" w:type="dxa"/>
+          </w:tcPr>
+          <w:p>
+            <w:r>
+              <w:t>Primary OR Other</w:t>
+            </w:r>
+          </w:p>
+        </w:tc>
+        <w:tc>
+          <w:tcPr>
+            <w:tcW w:w="2243" w:type="dxa"/>
+          </w:tcPr>
+          <w:p>
+            <w:r>
+              <w:t>YES</w:t>
+            </w:r>
+          </w:p>
+        </w:tc>
+        <w:tc>
+          <w:tcPr>
+            <w:tcW w:w="1564" w:type="dxa"/>
+          </w:tcPr>
+          <w:p/>
+        </w:tc>
+        <w:tc>
+          <w:tcPr>
+            <w:tcW w:w="1478" w:type="dxa"/>
+          </w:tcPr>
+          <w:p/>
+        </w:tc>
+      </w:tr>
+      <w:tr>
+        <w:tc>
+          <w:tcPr>
+            <w:tcW w:w="1388" w:type="dxa"/>
+          </w:tcPr>
+          <w:p>
+            <w:proofErr w:type="spellStart"/>
+            <w:r>
+              <w:t>Track_artist_PK</w:t>
+            </w:r>
+            <w:proofErr w:type="spellEnd"/>
+          </w:p>
+        </w:tc>
+        <w:tc>
+          <w:tcPr>
+            <w:tcW w:w="1076" w:type="dxa"/>
+          </w:tcPr>
+          <w:p>
+            <w:r>
+              <w:t>Composite key</w:t>
+            </w:r>
+          </w:p>
+        </w:tc>
+        <w:tc>
+          <w:tcPr>
+            <w:tcW w:w="1267" w:type="dxa"/>
+          </w:tcPr>
+          <w:p/>
+        </w:tc>
+        <w:tc>
+          <w:tcPr>
+            <w:tcW w:w="2243" w:type="dxa"/>
+          </w:tcPr>
+          <w:p>
+            <w:r>
+              <w:t>YES</w:t>
+            </w:r>
+          </w:p>
+        </w:tc>
+        <w:tc>
+          <w:tcPr>
+            <w:tcW w:w="1564" w:type="dxa"/>
+          </w:tcPr>
+          <w:p>
+            <w:r>
+              <w:t>PK</w:t>
+            </w:r>
+          </w:p>
+        </w:tc>
+        <w:tc>
+          <w:tcPr>
+            <w:tcW w:w="1478" w:type="dxa"/>
+          </w:tcPr>
+          <w:p/>
+        </w:tc>
+      </w:tr>
+    </w:tbl>
+    <w:p/>
+    <w:tbl>
+      <w:tblPr>
+        <w:tblStyle w:val="TableGrid"/>
+        <w:tblW w:w="0" w:type="auto"/>
+        <w:tblLook w:val="04A0" w:firstRow="1" w:lastRow="0" w:firstColumn="1" w:lastColumn="0" w:noHBand="0" w:noVBand="1"/>
+      </w:tblPr>
+      <w:tblGrid>
+        <w:gridCol w:w="1793"/>
+        <w:gridCol w:w="1780"/>
+        <w:gridCol w:w="1156"/>
+        <w:gridCol w:w="1847"/>
+        <w:gridCol w:w="1175"/>
+        <w:gridCol w:w="1265"/>
+      </w:tblGrid>
+      <w:tr>
+        <w:tc>
+          <w:tcPr>
+            <w:tcW w:w="9016" w:type="dxa"/>
+            <w:gridSpan w:val="6"/>
+          </w:tcPr>
+          <w:p>
+            <w:pPr>
+              <w:jc w:val="center"/>
+            </w:pPr>
+            <w:r>
+              <w:t>Track</w:t>
+            </w:r>
+          </w:p>
+        </w:tc>
+      </w:tr>
+      <w:tr>
+        <w:tc>
+          <w:tcPr>
+            <w:tcW w:w="1388" w:type="dxa"/>
+          </w:tcPr>
+          <w:p>
+            <w:r>
+              <w:t>Attribute</w:t>
+            </w:r>
+          </w:p>
+        </w:tc>
+        <w:tc>
+          <w:tcPr>
+            <w:tcW w:w="1076" w:type="dxa"/>
+          </w:tcPr>
+          <w:p>
+            <w:r>
+              <w:t>Data type</w:t>
+            </w:r>
+          </w:p>
+        </w:tc>
+        <w:tc>
+          <w:tcPr>
+            <w:tcW w:w="1267" w:type="dxa"/>
+          </w:tcPr>
+          <w:p>
+            <w:r>
+              <w:t>Format</w:t>
+            </w:r>
+          </w:p>
+        </w:tc>
+        <w:tc>
+          <w:tcPr>
+            <w:tcW w:w="2243" w:type="dxa"/>
+          </w:tcPr>
+          <w:p>
+            <w:r>
+              <w:t>Required</w:t>
+            </w:r>
+          </w:p>
+        </w:tc>
+        <w:tc>
+          <w:tcPr>
+            <w:tcW w:w="1564" w:type="dxa"/>
+          </w:tcPr>
+          <w:p>
+            <w:r>
+              <w:t>PK or FK</w:t>
+            </w:r>
+          </w:p>
+        </w:tc>
+        <w:tc>
+          <w:tcPr>
+            <w:tcW w:w="1478" w:type="dxa"/>
+          </w:tcPr>
+          <w:p>
+            <w:r>
+              <w:t>FK table</w:t>
+            </w:r>
+          </w:p>
+        </w:tc>
+      </w:tr>
+      <w:tr>
+        <w:tc>
+          <w:tcPr>
+            <w:tcW w:w="1388" w:type="dxa"/>
+          </w:tcPr>
+          <w:p>
+            <w:proofErr w:type="spellStart"/>
+            <w:r>
+              <w:t>Spotify_URL</w:t>
+            </w:r>
+            <w:proofErr w:type="spellEnd"/>
+          </w:p>
+        </w:tc>
+        <w:tc>
+          <w:tcPr>
+            <w:tcW w:w="1076" w:type="dxa"/>
+          </w:tcPr>
+          <w:p>
+            <w:proofErr w:type="gramStart"/>
+            <w:r>
+              <w:t>VARCHAR(</w:t>
+            </w:r>
+            <w:proofErr w:type="gramEnd"/>
+            <w:r>
+              <w:t>255)</w:t>
+            </w:r>
+          </w:p>
+        </w:tc>
+        <w:tc>
+          <w:tcPr>
+            <w:tcW w:w="1267" w:type="dxa"/>
+          </w:tcPr>
+          <w:p/>
+        </w:tc>
+        <w:tc>
+          <w:tcPr>
+            <w:tcW w:w="2243" w:type="dxa"/>
+          </w:tcPr>
+          <w:p>
+            <w:r>
+              <w:t>YES</w:t>
+            </w:r>
+          </w:p>
+        </w:tc>
+        <w:tc>
+          <w:tcPr>
+            <w:tcW w:w="1564" w:type="dxa"/>
+          </w:tcPr>
+          <w:p>
+            <w:r>
+              <w:t>PK</w:t>
+            </w:r>
+          </w:p>
+        </w:tc>
+        <w:tc>
+          <w:tcPr>
+            <w:tcW w:w="1478" w:type="dxa"/>
+          </w:tcPr>
+          <w:p/>
+        </w:tc>
+      </w:tr>
+      <w:tr>
+        <w:tc>
+          <w:tcPr>
+            <w:tcW w:w="1388" w:type="dxa"/>
+          </w:tcPr>
+          <w:p>
+            <w:proofErr w:type="spellStart"/>
+            <w:r>
+              <w:t>Track_name</w:t>
+            </w:r>
+            <w:proofErr w:type="spellEnd"/>
+          </w:p>
+        </w:tc>
+        <w:tc>
+          <w:tcPr>
+            <w:tcW w:w="1076" w:type="dxa"/>
+          </w:tcPr>
+          <w:p>
+            <w:proofErr w:type="gramStart"/>
+            <w:r>
+              <w:t>VARCHAR(</w:t>
+            </w:r>
+            <w:proofErr w:type="gramEnd"/>
+            <w:r>
+              <w:t>255)</w:t>
+            </w:r>
+          </w:p>
+        </w:tc>
+        <w:tc>
+          <w:tcPr>
+            <w:tcW w:w="1267" w:type="dxa"/>
+          </w:tcPr>
+          <w:p/>
+        </w:tc>
+        <w:tc>
+          <w:tcPr>
+            <w:tcW w:w="2243" w:type="dxa"/>
+          </w:tcPr>
+          <w:p>
+            <w:r>
+              <w:t>YES</w:t>
+            </w:r>
+          </w:p>
+        </w:tc>
+        <w:tc>
+          <w:tcPr>
+            <w:tcW w:w="1564" w:type="dxa"/>
+          </w:tcPr>
+          <w:p/>
+        </w:tc>
+        <w:tc>
+          <w:tcPr>
+            <w:tcW w:w="1478" w:type="dxa"/>
+          </w:tcPr>
+          <w:p/>
+        </w:tc>
+      </w:tr>
+      <w:tr>
+        <w:tc>
+          <w:tcPr>
+            <w:tcW w:w="1388" w:type="dxa"/>
+          </w:tcPr>
+          <w:p>
+            <w:proofErr w:type="spellStart"/>
+            <w:r>
+              <w:t>Album_ID</w:t>
+            </w:r>
+            <w:proofErr w:type="spellEnd"/>
+          </w:p>
+        </w:tc>
+        <w:tc>
+          <w:tcPr>
+            <w:tcW w:w="1076" w:type="dxa"/>
+          </w:tcPr>
+          <w:p>
+            <w:r>
+              <w:t>INT</w:t>
+            </w:r>
+          </w:p>
+        </w:tc>
+        <w:tc>
+          <w:tcPr>
+            <w:tcW w:w="1267" w:type="dxa"/>
+          </w:tcPr>
+          <w:p/>
+        </w:tc>
+        <w:tc>
+          <w:tcPr>
+            <w:tcW w:w="2243" w:type="dxa"/>
+          </w:tcPr>
+          <w:p>
+            <w:r>
+              <w:t>YES</w:t>
+            </w:r>
+          </w:p>
+        </w:tc>
+        <w:tc>
+          <w:tcPr>
+            <w:tcW w:w="1564" w:type="dxa"/>
+          </w:tcPr>
+          <w:p>
+            <w:r>
+              <w:t>FK</w:t>
+            </w:r>
+          </w:p>
+        </w:tc>
+        <w:tc>
+          <w:tcPr>
+            <w:tcW w:w="1478" w:type="dxa"/>
+          </w:tcPr>
+          <w:p>
+            <w:r>
+              <w:t>Album</w:t>
+            </w:r>
+          </w:p>
+        </w:tc>
+      </w:tr>
+      <w:tr>
+        <w:tc>
+          <w:tcPr>
+            <w:tcW w:w="1388" w:type="dxa"/>
+          </w:tcPr>
+          <w:p>
+            <w:proofErr w:type="spellStart"/>
+            <w:r>
+              <w:t>Track_number</w:t>
+            </w:r>
+            <w:proofErr w:type="spellEnd"/>
+          </w:p>
+        </w:tc>
+        <w:tc>
+          <w:tcPr>
+            <w:tcW w:w="1076" w:type="dxa"/>
+          </w:tcPr>
+          <w:p>
+            <w:r>
+              <w:t>INT</w:t>
+            </w:r>
+          </w:p>
+        </w:tc>
+        <w:tc>
+          <w:tcPr>
+            <w:tcW w:w="1267" w:type="dxa"/>
+          </w:tcPr>
+          <w:p/>
+        </w:tc>
+        <w:tc>
+          <w:tcPr>
+            <w:tcW w:w="2243" w:type="dxa"/>
+          </w:tcPr>
+          <w:p>
+            <w:r>
+              <w:t>YES</w:t>
+            </w:r>
+          </w:p>
+        </w:tc>
+        <w:tc>
+          <w:tcPr>
+            <w:tcW w:w="1564" w:type="dxa"/>
+          </w:tcPr>
+          <w:p/>
+        </w:tc>
+        <w:tc>
+          <w:tcPr>
+            <w:tcW w:w="1478" w:type="dxa"/>
+          </w:tcPr>
+          <w:p/>
+        </w:tc>
+      </w:tr>
+      <w:tr>
+        <w:tc>
+          <w:tcPr>
+            <w:tcW w:w="1388" w:type="dxa"/>
+          </w:tcPr>
+          <w:p>
+            <w:r>
+              <w:t>Explicit</w:t>
+            </w:r>
+          </w:p>
+        </w:tc>
+        <w:tc>
+          <w:tcPr>
+            <w:tcW w:w="1076" w:type="dxa"/>
+          </w:tcPr>
+          <w:p>
+            <w:r>
+              <w:t>BOOLEAN</w:t>
+            </w:r>
+          </w:p>
+        </w:tc>
+        <w:tc>
+          <w:tcPr>
+            <w:tcW w:w="1267" w:type="dxa"/>
+          </w:tcPr>
+          <w:p/>
+        </w:tc>
+        <w:tc>
+          <w:tcPr>
+            <w:tcW w:w="2243" w:type="dxa"/>
+          </w:tcPr>
+          <w:p>
+            <w:r>
+              <w:t>YES</w:t>
+            </w:r>
+          </w:p>
+        </w:tc>
+        <w:tc>
+          <w:tcPr>
+            <w:tcW w:w="1564" w:type="dxa"/>
+          </w:tcPr>
+          <w:p/>
+        </w:tc>
+        <w:tc>
+          <w:tcPr>
+            <w:tcW w:w="1478" w:type="dxa"/>
+          </w:tcPr>
+          <w:p/>
+        </w:tc>
+      </w:tr>
+      <w:tr>
+        <w:tc>
+          <w:tcPr>
+            <w:tcW w:w="1388" w:type="dxa"/>
+          </w:tcPr>
+          <w:p>
+            <w:r>
+              <w:t>Duration (</w:t>
+            </w:r>
+            <w:proofErr w:type="spellStart"/>
+            <w:r>
+              <w:t>ms</w:t>
+            </w:r>
+            <w:proofErr w:type="spellEnd"/>
+            <w:r>
+              <w:t>)</w:t>
+            </w:r>
+          </w:p>
+        </w:tc>
+        <w:tc>
+          <w:tcPr>
+            <w:tcW w:w="1076" w:type="dxa"/>
+          </w:tcPr>
+          <w:p>
+            <w:r>
+              <w:t>INT</w:t>
+            </w:r>
+          </w:p>
+        </w:tc>
+        <w:tc>
+          <w:tcPr>
+            <w:tcW w:w="1267" w:type="dxa"/>
+          </w:tcPr>
+          <w:p/>
+        </w:tc>
+        <w:tc>
+          <w:tcPr>
+            <w:tcW w:w="2243" w:type="dxa"/>
+          </w:tcPr>
+          <w:p>
+            <w:r>
+              <w:t>YES</w:t>
+            </w:r>
+          </w:p>
+        </w:tc>
+        <w:tc>
+          <w:tcPr>
+            <w:tcW w:w="1564" w:type="dxa"/>
+          </w:tcPr>
+          <w:p/>
+        </w:tc>
+        <w:tc>
+          <w:tcPr>
+            <w:tcW w:w="1478" w:type="dxa"/>
+          </w:tcPr>
+          <w:p/>
+        </w:tc>
+      </w:tr>
+      <w:tr>
+        <w:tc>
+          <w:tcPr>
+            <w:tcW w:w="1388" w:type="dxa"/>
+          </w:tcPr>
+          <w:p>
+            <w:r>
+              <w:t>Tempo</w:t>
+            </w:r>
+          </w:p>
+        </w:tc>
+        <w:tc>
+          <w:tcPr>
+            <w:tcW w:w="1076" w:type="dxa"/>
+          </w:tcPr>
+          <w:p>
+            <w:r>
+              <w:t>INT</w:t>
+            </w:r>
+          </w:p>
+        </w:tc>
+        <w:tc>
+          <w:tcPr>
+            <w:tcW w:w="1267" w:type="dxa"/>
+          </w:tcPr>
+          <w:p/>
+        </w:tc>
+        <w:tc>
+          <w:tcPr>
+            <w:tcW w:w="2243" w:type="dxa"/>
+          </w:tcPr>
+          <w:p>
+            <w:r>
+              <w:t>YES</w:t>
+            </w:r>
+          </w:p>
+        </w:tc>
+        <w:tc>
+          <w:tcPr>
+            <w:tcW w:w="1564" w:type="dxa"/>
+          </w:tcPr>
+          <w:p/>
+        </w:tc>
+        <w:tc>
+          <w:tcPr>
+            <w:tcW w:w="1478" w:type="dxa"/>
+          </w:tcPr>
+          <w:p/>
+        </w:tc>
+      </w:tr>
+      <w:tr>
+        <w:tc>
+          <w:tcPr>
+            <w:tcW w:w="1388" w:type="dxa"/>
+          </w:tcPr>
+          <w:p>
+            <w:proofErr w:type="spellStart"/>
+            <w:r>
+              <w:t>Time_signature</w:t>
+            </w:r>
+            <w:proofErr w:type="spellEnd"/>
+          </w:p>
+        </w:tc>
+        <w:tc>
+          <w:tcPr>
+            <w:tcW w:w="1076" w:type="dxa"/>
+          </w:tcPr>
+          <w:p>
+            <w:r>
+              <w:t>INT</w:t>
+            </w:r>
+          </w:p>
+        </w:tc>
+        <w:tc>
+          <w:tcPr>
+            <w:tcW w:w="1267" w:type="dxa"/>
+          </w:tcPr>
+          <w:p/>
+        </w:tc>
+        <w:tc>
+          <w:tcPr>
+            <w:tcW w:w="2243" w:type="dxa"/>
+          </w:tcPr>
+          <w:p>
+            <w:r>
+              <w:t>YES</w:t>
+            </w:r>
+          </w:p>
+        </w:tc>
+        <w:tc>
+          <w:tcPr>
+            <w:tcW w:w="1564" w:type="dxa"/>
+          </w:tcPr>
+          <w:p/>
+        </w:tc>
+        <w:tc>
+          <w:tcPr>
+            <w:tcW w:w="1478" w:type="dxa"/>
+          </w:tcPr>
+          <w:p/>
+        </w:tc>
+      </w:tr>
+    </w:tbl>
+    <w:p/>
+    <w:tbl>
+      <w:tblPr>
+        <w:tblStyle w:val="TableGrid"/>
+        <w:tblW w:w="0" w:type="auto"/>
+        <w:tblLook w:val="04A0" w:firstRow="1" w:lastRow="0" w:firstColumn="1" w:lastColumn="0" w:noHBand="0" w:noVBand="1"/>
+      </w:tblPr>
+      <w:tblGrid>
+        <w:gridCol w:w="1633"/>
+        <w:gridCol w:w="1780"/>
+        <w:gridCol w:w="1176"/>
+        <w:gridCol w:w="1919"/>
+        <w:gridCol w:w="1245"/>
+        <w:gridCol w:w="1263"/>
+      </w:tblGrid>
+      <w:tr>
+        <w:tc>
+          <w:tcPr>
+            <w:tcW w:w="9016" w:type="dxa"/>
+            <w:gridSpan w:val="6"/>
+          </w:tcPr>
+          <w:p>
+            <w:pPr>
+              <w:jc w:val="center"/>
+            </w:pPr>
+            <w:r>
+              <w:t>Album</w:t>
+            </w:r>
+          </w:p>
+        </w:tc>
+      </w:tr>
+      <w:tr>
+        <w:tc>
+          <w:tcPr>
+            <w:tcW w:w="1423" w:type="dxa"/>
+          </w:tcPr>
+          <w:p>
+            <w:r>
+              <w:t>Attribute</w:t>
+            </w:r>
+          </w:p>
+        </w:tc>
+        <w:tc>
+          <w:tcPr>
+            <w:tcW w:w="1073" w:type="dxa"/>
+          </w:tcPr>
+          <w:p>
+            <w:r>
+              <w:t>Data type</w:t>
+            </w:r>
+          </w:p>
+        </w:tc>
+        <w:tc>
+          <w:tcPr>
+            <w:tcW w:w="1264" w:type="dxa"/>
+          </w:tcPr>
+          <w:p>
+            <w:r>
+              <w:t>Format</w:t>
+            </w:r>
+          </w:p>
+        </w:tc>
+        <w:tc>
+          <w:tcPr>
+            <w:tcW w:w="2234" w:type="dxa"/>
+          </w:tcPr>
+          <w:p>
+            <w:r>
+              <w:t>Required</w:t>
+            </w:r>
+          </w:p>
+        </w:tc>
+        <w:tc>
+          <w:tcPr>
+            <w:tcW w:w="1555" w:type="dxa"/>
+          </w:tcPr>
+          <w:p>
+            <w:r>
+              <w:t>PK or FK</w:t>
+            </w:r>
+          </w:p>
+        </w:tc>
+        <w:tc>
+          <w:tcPr>
+            <w:tcW w:w="1467" w:type="dxa"/>
+          </w:tcPr>
+          <w:p>
+            <w:r>
+              <w:t>FK table</w:t>
+            </w:r>
+          </w:p>
+        </w:tc>
+      </w:tr>
+      <w:tr>
+        <w:tc>
+          <w:tcPr>
+            <w:tcW w:w="1423" w:type="dxa"/>
+          </w:tcPr>
+          <w:p>
+            <w:proofErr w:type="spellStart"/>
+            <w:r>
+              <w:t>Album_ID</w:t>
+            </w:r>
+            <w:proofErr w:type="spellEnd"/>
+          </w:p>
+        </w:tc>
+        <w:tc>
+          <w:tcPr>
+            <w:tcW w:w="1073" w:type="dxa"/>
+          </w:tcPr>
+          <w:p>
+            <w:r>
+              <w:t>INT</w:t>
+            </w:r>
+          </w:p>
+        </w:tc>
+        <w:tc>
+          <w:tcPr>
+            <w:tcW w:w="1264" w:type="dxa"/>
+          </w:tcPr>
+          <w:p/>
+        </w:tc>
+        <w:tc>
+          <w:tcPr>
+            <w:tcW w:w="2234" w:type="dxa"/>
+          </w:tcPr>
+          <w:p>
+            <w:r>
+              <w:t>YES</w:t>
+            </w:r>
+          </w:p>
+        </w:tc>
+        <w:tc>
+          <w:tcPr>
+            <w:tcW w:w="1555" w:type="dxa"/>
+          </w:tcPr>
+          <w:p>
+            <w:r>
+              <w:t>PK</w:t>
+            </w:r>
+          </w:p>
+        </w:tc>
+        <w:tc>
+          <w:tcPr>
+            <w:tcW w:w="1467" w:type="dxa"/>
+          </w:tcPr>
+          <w:p/>
+        </w:tc>
+      </w:tr>
+      <w:tr>
+        <w:tc>
+          <w:tcPr>
+            <w:tcW w:w="1423" w:type="dxa"/>
+          </w:tcPr>
+          <w:p>
+            <w:proofErr w:type="spellStart"/>
+            <w:r>
+              <w:t>Artist_ID</w:t>
+            </w:r>
+            <w:proofErr w:type="spellEnd"/>
+          </w:p>
+        </w:tc>
+        <w:tc>
+          <w:tcPr>
+            <w:tcW w:w="1073" w:type="dxa"/>
+          </w:tcPr>
+          <w:p>
+            <w:r>
+              <w:t>INT</w:t>
+            </w:r>
+          </w:p>
+        </w:tc>
+        <w:tc>
+          <w:tcPr>
+            <w:tcW w:w="1264" w:type="dxa"/>
+          </w:tcPr>
+          <w:p/>
+        </w:tc>
+        <w:tc>
+          <w:tcPr>
+            <w:tcW w:w="2234" w:type="dxa"/>
+          </w:tcPr>
+          <w:p>
+            <w:r>
+              <w:t xml:space="preserve">YES </w:t>
+            </w:r>
+          </w:p>
+        </w:tc>
+        <w:tc>
+          <w:tcPr>
+            <w:tcW w:w="1555" w:type="dxa"/>
+          </w:tcPr>
+          <w:p>
+            <w:r>
+              <w:t>FK</w:t>
+            </w:r>
+          </w:p>
+        </w:tc>
+        <w:tc>
+          <w:tcPr>
+            <w:tcW w:w="1467" w:type="dxa"/>
+          </w:tcPr>
+          <w:p>
+            <w:r>
+              <w:t>Artist</w:t>
+            </w:r>
+          </w:p>
+        </w:tc>
+      </w:tr>
+      <w:tr>
+        <w:tc>
+          <w:tcPr>
+            <w:tcW w:w="1423" w:type="dxa"/>
+          </w:tcPr>
+          <w:p>
+            <w:r>
+              <w:t>Title</w:t>
+            </w:r>
+          </w:p>
+        </w:tc>
+        <w:tc>
+          <w:tcPr>
+            <w:tcW w:w="1073" w:type="dxa"/>
+          </w:tcPr>
+          <w:p>
+            <w:proofErr w:type="gramStart"/>
+            <w:r>
+              <w:t>VARCHAR(</w:t>
+            </w:r>
+            <w:proofErr w:type="gramEnd"/>
+            <w:r>
+              <w:t>255)</w:t>
+            </w:r>
+          </w:p>
+        </w:tc>
+        <w:tc>
+          <w:tcPr>
+            <w:tcW w:w="1264" w:type="dxa"/>
+          </w:tcPr>
+          <w:p/>
+        </w:tc>
+        <w:tc>
+          <w:tcPr>
+            <w:tcW w:w="2234" w:type="dxa"/>
+          </w:tcPr>
+          <w:p>
+            <w:r>
+              <w:t>YES</w:t>
+            </w:r>
+          </w:p>
+        </w:tc>
+        <w:tc>
+          <w:tcPr>
+            <w:tcW w:w="1555" w:type="dxa"/>
+          </w:tcPr>
+          <w:p/>
+        </w:tc>
+        <w:tc>
+          <w:tcPr>
+            <w:tcW w:w="1467" w:type="dxa"/>
+          </w:tcPr>
+          <w:p/>
+        </w:tc>
+      </w:tr>
+      <w:tr>
+        <w:tc>
+          <w:tcPr>
+            <w:tcW w:w="1423" w:type="dxa"/>
+          </w:tcPr>
+          <w:p>
+            <w:proofErr w:type="spellStart"/>
+            <w:r>
+              <w:t>Release_date</w:t>
+            </w:r>
+            <w:proofErr w:type="spellEnd"/>
+          </w:p>
+        </w:tc>
+        <w:tc>
+          <w:tcPr>
+            <w:tcW w:w="1073" w:type="dxa"/>
+          </w:tcPr>
+          <w:p>
+            <w:r>
+              <w:t>DATE</w:t>
+            </w:r>
+          </w:p>
+        </w:tc>
+        <w:tc>
+          <w:tcPr>
+            <w:tcW w:w="1264" w:type="dxa"/>
+          </w:tcPr>
+          <w:p>
+            <w:r>
+              <w:t>DD-MM-YYYY</w:t>
+            </w:r>
+          </w:p>
+        </w:tc>
+        <w:tc>
+          <w:tcPr>
+            <w:tcW w:w="2234" w:type="dxa"/>
+          </w:tcPr>
+          <w:p>
+            <w:r>
+              <w:t>YES</w:t>
+            </w:r>
+          </w:p>
+        </w:tc>
+        <w:tc>
+          <w:tcPr>
+            <w:tcW w:w="1555" w:type="dxa"/>
+          </w:tcPr>
+          <w:p/>
+        </w:tc>
+        <w:tc>
+          <w:tcPr>
+            <w:tcW w:w="1467" w:type="dxa"/>
+          </w:tcPr>
+          <w:p/>
+        </w:tc>
+      </w:tr>
+      <w:tr>
+        <w:tc>
+          <w:tcPr>
+            <w:tcW w:w="1423" w:type="dxa"/>
+          </w:tcPr>
+          <w:p>
+            <w:proofErr w:type="spellStart"/>
+            <w:r>
+              <w:t>Album_image</w:t>
+            </w:r>
+            <w:proofErr w:type="spellEnd"/>
+          </w:p>
+        </w:tc>
+        <w:tc>
+          <w:tcPr>
+            <w:tcW w:w="1073" w:type="dxa"/>
+          </w:tcPr>
+          <w:p>
+            <w:r>
+              <w:t>IMAGE</w:t>
+            </w:r>
+          </w:p>
+        </w:tc>
+        <w:tc>
+          <w:tcPr>
+            <w:tcW w:w="1264" w:type="dxa"/>
+          </w:tcPr>
+          <w:p/>
+        </w:tc>
+        <w:tc>
+          <w:tcPr>
+            <w:tcW w:w="2234" w:type="dxa"/>
+          </w:tcPr>
+          <w:p>
+            <w:r>
+              <w:t>NO</w:t>
+            </w:r>
+          </w:p>
+        </w:tc>
+        <w:tc>
+          <w:tcPr>
+            <w:tcW w:w="1555" w:type="dxa"/>
+          </w:tcPr>
+          <w:p/>
+        </w:tc>
+        <w:tc>
+          <w:tcPr>
+            <w:tcW w:w="1467" w:type="dxa"/>
+          </w:tcPr>
+          <w:p/>
+        </w:tc>
+      </w:tr>
+    </w:tbl>
+    <w:p/>
+    <w:p>
+      <w:pPr>
+        <w:pStyle w:val="Heading1"/>
+      </w:pPr>
+      <w:r>
+        <w:t>ERD</w:t>
+      </w:r>
+    </w:p>
+    <w:p>
+      <w:r>
+        <w:t>Below is an ERD diagram for the song archive database. The issue between profiles following artists has been resolved by introducing a follower table to store all follower relationships.</w:t>
+      </w:r>
+    </w:p>
+    <w:p>
+      <w:pPr>
+        <w:pStyle w:val="Heading1"/>
+      </w:pPr>
+      <w:r>
+        <w:rPr>
+          <w:noProof/>
+        </w:rPr>
+        <w:lastRenderedPageBreak/>
+        <w:drawing>
+          <wp:inline distT="0" distB="0" distL="0" distR="0" wp14:anchorId="4B26576F" wp14:editId="15F5400F">
+            <wp:extent cx="5724525" cy="2479040"/>
+            <wp:effectExtent l="0" t="0" r="9525" b="0"/>
+            <wp:docPr id="916478141" name="Picture 1"/>
+            <wp:cNvGraphicFramePr>
+              <a:graphicFrameLocks xmlns:a="http://schemas.openxmlformats.org/drawingml/2006/main" noChangeAspect="1"/>
+            </wp:cNvGraphicFramePr>
+            <a:graphic xmlns:a="http://schemas.openxmlformats.org/drawingml/2006/main">
+              <a:graphicData uri="http://schemas.openxmlformats.org/drawingml/2006/picture">
+                <pic:pic xmlns:pic="http://schemas.openxmlformats.org/drawingml/2006/picture">
+                  <pic:nvPicPr>
+                    <pic:cNvPr id="0" name="Picture 1"/>
+                    <pic:cNvPicPr>
+                      <a:picLocks noChangeAspect="1" noChangeArrowheads="1"/>
+                    </pic:cNvPicPr>
+                  </pic:nvPicPr>
+                  <pic:blipFill>
+                    <a:blip r:embed="rId5" cstate="print">
+                      <a:extLst>
+                        <a:ext uri="{28A0092B-C50C-407E-A947-70E740481C1C}">
+                          <a14:useLocalDpi xmlns:a14="http://schemas.microsoft.com/office/drawing/2010/main"/>
+                        </a:ext>
+                      </a:extLst>
+                    </a:blip>
+                    <a:srcRect/>
+                    <a:stretch>
+                      <a:fillRect/>
+                    </a:stretch>
+                  </pic:blipFill>
+                  <pic:spPr bwMode="auto">
+                    <a:xfrm>
+                      <a:off x="0" y="0"/>
+                      <a:ext cx="5724525" cy="2479040"/>
+                    </a:xfrm>
+                    <a:prstGeom prst="rect">
+                      <a:avLst/>
+                    </a:prstGeom>
+                    <a:noFill/>
+                    <a:ln>
+                      <a:noFill/>
+                    </a:ln>
+                  </pic:spPr>
+                </pic:pic>
+              </a:graphicData>
+            </a:graphic>
+          </wp:inline>
+        </w:drawing>
+      </w:r>
+      <w:r>
+        <w:t>Wireframes</w:t>
+      </w:r>
+    </w:p>
+    <w:p>
+      <w:pPr>
+        <w:pStyle w:val="Heading2"/>
+      </w:pPr>
+      <w:r>
+        <w:t>homepage</w:t>
+      </w:r>
+    </w:p>
+    <w:p>
+      <w:r>
+        <w:rPr>
+          <w:noProof/>
+        </w:rPr>
+        <w:drawing>
+          <wp:inline distT="0" distB="0" distL="0" distR="0" wp14:anchorId="5DD810D0" wp14:editId="275D1C47">
+            <wp:extent cx="5731510" cy="3234690"/>
+            <wp:effectExtent l="0" t="0" r="2540" b="3810"/>
+            <wp:docPr id="1986413062" name="Picture 1"/>
+            <wp:cNvGraphicFramePr>
+              <a:graphicFrameLocks xmlns:a="http://schemas.openxmlformats.org/drawingml/2006/main" noChangeAspect="1"/>
+            </wp:cNvGraphicFramePr>
+            <a:graphic xmlns:a="http://schemas.openxmlformats.org/drawingml/2006/main">
+              <a:graphicData uri="http://schemas.openxmlformats.org/drawingml/2006/picture">
+                <pic:pic xmlns:pic="http://schemas.openxmlformats.org/drawingml/2006/picture">
+                  <pic:nvPicPr>
+                    <pic:cNvPr id="1986413062" name=""/>
+                    <pic:cNvPicPr/>
+                  </pic:nvPicPr>
+                  <pic:blipFill>
+                    <a:blip r:embed="rId6" cstate="print">
+                      <a:extLst>
+                        <a:ext uri="{28A0092B-C50C-407E-A947-70E740481C1C}">
+                          <a14:useLocalDpi xmlns:a14="http://schemas.microsoft.com/office/drawing/2010/main"/>
+                        </a:ext>
+                      </a:extLst>
+                    </a:blip>
+                    <a:stretch>
+                      <a:fillRect/>
+                    </a:stretch>
+                  </pic:blipFill>
+                  <pic:spPr>
+                    <a:xfrm>
+                      <a:off x="0" y="0"/>
+                      <a:ext cx="5731510" cy="3234690"/>
+                    </a:xfrm>
+                    <a:prstGeom prst="rect">
+                      <a:avLst/>
+                    </a:prstGeom>
+                  </pic:spPr>
+                </pic:pic>
+              </a:graphicData>
+            </a:graphic>
+          </wp:inline>
+        </w:drawing>
+      </w:r>
+    </w:p>
+    <w:p>
+      <w:pPr>
+        <w:pStyle w:val="Heading2"/>
+      </w:pPr>
+      <w:r>
+        <w:lastRenderedPageBreak/>
+        <w:t>User management</w:t>
+      </w:r>
+    </w:p>
+    <w:p>
+      <w:r>
+        <w:rPr>
+          <w:noProof/>
+        </w:rPr>
+        <w:drawing>
+          <wp:inline distT="0" distB="0" distL="0" distR="0" wp14:anchorId="2492AD21" wp14:editId="095119B2">
+            <wp:extent cx="5731510" cy="3216275"/>
+            <wp:effectExtent l="0" t="0" r="2540" b="3175"/>
+            <wp:docPr id="604907979" name="Picture 1"/>
+            <wp:cNvGraphicFramePr>
+              <a:graphicFrameLocks xmlns:a="http://schemas.openxmlformats.org/drawingml/2006/main" noChangeAspect="1"/>
+            </wp:cNvGraphicFramePr>
+            <a:graphic xmlns:a="http://schemas.openxmlformats.org/drawingml/2006/main">
+              <a:graphicData uri="http://schemas.openxmlformats.org/drawingml/2006/picture">
+                <pic:pic xmlns:pic="http://schemas.openxmlformats.org/drawingml/2006/picture">
+                  <pic:nvPicPr>
+                    <pic:cNvPr id="604907979" name=""/>
+                    <pic:cNvPicPr/>
+                  </pic:nvPicPr>
+                  <pic:blipFill>
+                    <a:blip r:embed="rId7" cstate="print">
+                      <a:extLst>
+                        <a:ext uri="{28A0092B-C50C-407E-A947-70E740481C1C}">
+                          <a14:useLocalDpi xmlns:a14="http://schemas.microsoft.com/office/drawing/2010/main"/>
+                        </a:ext>
+                      </a:extLst>
+                    </a:blip>
+                    <a:stretch>
+                      <a:fillRect/>
+                    </a:stretch>
+                  </pic:blipFill>
+                  <pic:spPr>
+                    <a:xfrm>
+                      <a:off x="0" y="0"/>
+                      <a:ext cx="5731510" cy="3216275"/>
+                    </a:xfrm>
+                    <a:prstGeom prst="rect">
+                      <a:avLst/>
+                    </a:prstGeom>
+                  </pic:spPr>
+                </pic:pic>
+              </a:graphicData>
+            </a:graphic>
+          </wp:inline>
+        </w:drawing>
+      </w:r>
+    </w:p>
+    <w:p>
+      <w:pPr>
+        <w:pStyle w:val="Heading2"/>
+      </w:pPr>
+      <w:r>
+        <w:lastRenderedPageBreak/>
+        <w:t>Search page</w:t>
+      </w:r>
+    </w:p>
+    <w:p>
+      <w:pPr>
+        <w:pStyle w:val="Heading2"/>
+      </w:pPr>
+      <w:r>
+        <w:rPr>
+          <w:rFonts w:asciiTheme="minorHAnsi" w:eastAsiaTheme="minorHAnsi" w:hAnsiTheme="minorHAnsi" w:cstheme="minorBidi"/>
+          <w:noProof/>
+          <w:color w:val="auto"/>
+          <w:sz w:val="24"/>
+          <w:szCs w:val="24"/>
+        </w:rPr>
+        <w:drawing>
+          <wp:inline distT="0" distB="0" distL="0" distR="0" wp14:anchorId="6BCE442D" wp14:editId="6929F2B6">
+            <wp:extent cx="5731510" cy="3235325"/>
+            <wp:effectExtent l="0" t="0" r="2540" b="3175"/>
+            <wp:docPr id="1380257722" name="Picture 1"/>
+            <wp:cNvGraphicFramePr>
+              <a:graphicFrameLocks xmlns:a="http://schemas.openxmlformats.org/drawingml/2006/main" noChangeAspect="1"/>
+            </wp:cNvGraphicFramePr>
+            <a:graphic xmlns:a="http://schemas.openxmlformats.org/drawingml/2006/main">
+              <a:graphicData uri="http://schemas.openxmlformats.org/drawingml/2006/picture">
+                <pic:pic xmlns:pic="http://schemas.openxmlformats.org/drawingml/2006/picture">
+                  <pic:nvPicPr>
+                    <pic:cNvPr id="1380257722" name=""/>
+                    <pic:cNvPicPr/>
+                  </pic:nvPicPr>
+                  <pic:blipFill>
+                    <a:blip r:embed="rId8" cstate="print">
+                      <a:extLst>
+                        <a:ext uri="{28A0092B-C50C-407E-A947-70E740481C1C}">
+                          <a14:useLocalDpi xmlns:a14="http://schemas.microsoft.com/office/drawing/2010/main"/>
+                        </a:ext>
+                      </a:extLst>
+                    </a:blip>
+                    <a:stretch>
+                      <a:fillRect/>
+                    </a:stretch>
+                  </pic:blipFill>
+                  <pic:spPr>
+                    <a:xfrm>
+                      <a:off x="0" y="0"/>
+                      <a:ext cx="5731510" cy="3235325"/>
+                    </a:xfrm>
+                    <a:prstGeom prst="rect">
+                      <a:avLst/>
+                    </a:prstGeom>
+                  </pic:spPr>
+                </pic:pic>
+              </a:graphicData>
+            </a:graphic>
+          </wp:inline>
+        </w:drawing>
+      </w:r>
+      <w:r>
+        <w:t>Artist page</w:t>
+      </w:r>
+    </w:p>
+    <w:p>
+      <w:pPr>
+        <w:pStyle w:val="Heading2"/>
+        <w:tabs>
+          <w:tab w:val="left" w:pos="6476"/>
+        </w:tabs>
+      </w:pPr>
+      <w:r>
+        <w:rPr>
+          <w:rFonts w:asciiTheme="minorHAnsi" w:eastAsiaTheme="minorHAnsi" w:hAnsiTheme="minorHAnsi" w:cstheme="minorBidi"/>
+          <w:noProof/>
+          <w:color w:val="auto"/>
+          <w:sz w:val="24"/>
+          <w:szCs w:val="24"/>
+        </w:rPr>
+        <w:drawing>
+          <wp:inline distT="0" distB="0" distL="0" distR="0" wp14:anchorId="26DFEAA2" wp14:editId="185717A9">
+            <wp:extent cx="5731510" cy="3220085"/>
+            <wp:effectExtent l="0" t="0" r="2540" b="0"/>
+            <wp:docPr id="1914171318" name="Picture 1"/>
+            <wp:cNvGraphicFramePr>
+              <a:graphicFrameLocks xmlns:a="http://schemas.openxmlformats.org/drawingml/2006/main" noChangeAspect="1"/>
+            </wp:cNvGraphicFramePr>
+            <a:graphic xmlns:a="http://schemas.openxmlformats.org/drawingml/2006/main">
+              <a:graphicData uri="http://schemas.openxmlformats.org/drawingml/2006/picture">
+                <pic:pic xmlns:pic="http://schemas.openxmlformats.org/drawingml/2006/picture">
+                  <pic:nvPicPr>
+                    <pic:cNvPr id="1914171318" name=""/>
+                    <pic:cNvPicPr/>
+                  </pic:nvPicPr>
+                  <pic:blipFill>
+                    <a:blip r:embed="rId9"/>
+                    <a:stretch>
+                      <a:fillRect/>
+                    </a:stretch>
+                  </pic:blipFill>
+                  <pic:spPr>
+                    <a:xfrm>
+                      <a:off x="0" y="0"/>
+                      <a:ext cx="5731510" cy="3220085"/>
+                    </a:xfrm>
+                    <a:prstGeom prst="rect">
+                      <a:avLst/>
+                    </a:prstGeom>
+                  </pic:spPr>
+                </pic:pic>
+              </a:graphicData>
+            </a:graphic>
+          </wp:inline>
+        </w:drawing>
+      </w:r>
+      <w:r>
+        <w:t>Album page</w:t>
+      </w:r>
+      <w:r>
+        <w:tab/>
+      </w:r>
+    </w:p>
+    <w:p>
+      <w:pPr>
+        <w:pStyle w:val="Heading2"/>
+      </w:pPr>
+      <w:r>
+        <w:rPr>
+          <w:rFonts w:asciiTheme="minorHAnsi" w:eastAsiaTheme="minorHAnsi" w:hAnsiTheme="minorHAnsi" w:cstheme="minorBidi"/>
+          <w:noProof/>
+          <w:color w:val="auto"/>
+          <w:sz w:val="24"/>
+          <w:szCs w:val="24"/>
+        </w:rPr>
+        <w:lastRenderedPageBreak/>
+        <w:drawing>
+          <wp:inline distT="0" distB="0" distL="0" distR="0" wp14:anchorId="4FBC9DA3" wp14:editId="7522BE6F">
+            <wp:extent cx="5731510" cy="3227705"/>
+            <wp:effectExtent l="0" t="0" r="2540" b="0"/>
+            <wp:docPr id="1819678789" name="Picture 1"/>
+            <wp:cNvGraphicFramePr>
+              <a:graphicFrameLocks xmlns:a="http://schemas.openxmlformats.org/drawingml/2006/main" noChangeAspect="1"/>
+            </wp:cNvGraphicFramePr>
+            <a:graphic xmlns:a="http://schemas.openxmlformats.org/drawingml/2006/main">
+              <a:graphicData uri="http://schemas.openxmlformats.org/drawingml/2006/picture">
+                <pic:pic xmlns:pic="http://schemas.openxmlformats.org/drawingml/2006/picture">
+                  <pic:nvPicPr>
+                    <pic:cNvPr id="1819678789" name=""/>
+                    <pic:cNvPicPr/>
+                  </pic:nvPicPr>
+                  <pic:blipFill>
+                    <a:blip r:embed="rId10"/>
+                    <a:stretch>
+                      <a:fillRect/>
+                    </a:stretch>
+                  </pic:blipFill>
+                  <pic:spPr>
+                    <a:xfrm>
+                      <a:off x="0" y="0"/>
+                      <a:ext cx="5731510" cy="3227705"/>
+                    </a:xfrm>
+                    <a:prstGeom prst="rect">
+                      <a:avLst/>
+                    </a:prstGeom>
+                  </pic:spPr>
+                </pic:pic>
+              </a:graphicData>
+            </a:graphic>
+          </wp:inline>
+        </w:drawing>
+      </w:r>
+      <w:r>
+        <w:t>User</w:t>
+      </w:r>
+      <w:r>
+        <w:t xml:space="preserve"> and Artist</w:t>
+      </w:r>
+      <w:r>
+        <w:t xml:space="preserve"> log</w:t>
+      </w:r>
+      <w:r>
+        <w:t>-</w:t>
+      </w:r>
+      <w:r>
+        <w:t>in and sign-up page</w:t>
+      </w:r>
+    </w:p>
+    <w:p>
+      <w:r>
+        <w:t>The user and Artist sign-up and log</w:t>
+      </w:r>
+      <w:r>
+        <w:t>-</w:t>
+      </w:r>
+      <w:r>
+        <w:t>in pages are very similar on the front end.</w:t>
+      </w:r>
+    </w:p>
+    <w:p>
+      <w:r>
+        <w:drawing>
+          <wp:inline distT="0" distB="0" distL="0" distR="0" wp14:anchorId="03B2D43C" wp14:editId="4AC727AA">
+            <wp:extent cx="5731510" cy="3210560"/>
+            <wp:effectExtent l="0" t="0" r="2540" b="8890"/>
+            <wp:docPr id="1652619370" name="Picture 1"/>
+            <wp:cNvGraphicFramePr>
+              <a:graphicFrameLocks xmlns:a="http://schemas.openxmlformats.org/drawingml/2006/main" noChangeAspect="1"/>
+            </wp:cNvGraphicFramePr>
+            <a:graphic xmlns:a="http://schemas.openxmlformats.org/drawingml/2006/main">
+              <a:graphicData uri="http://schemas.openxmlformats.org/drawingml/2006/picture">
+                <pic:pic xmlns:pic="http://schemas.openxmlformats.org/drawingml/2006/picture">
+                  <pic:nvPicPr>
+                    <pic:cNvPr id="1652619370" name=""/>
+                    <pic:cNvPicPr/>
+                  </pic:nvPicPr>
+                  <pic:blipFill>
+                    <a:blip r:embed="rId11"/>
+                    <a:stretch>
+                      <a:fillRect/>
+                    </a:stretch>
+                  </pic:blipFill>
+                  <pic:spPr>
+                    <a:xfrm>
+                      <a:off x="0" y="0"/>
+                      <a:ext cx="5731510" cy="3210560"/>
+                    </a:xfrm>
+                    <a:prstGeom prst="rect">
+                      <a:avLst/>
+                    </a:prstGeom>
+                  </pic:spPr>
+                </pic:pic>
+              </a:graphicData>
+            </a:graphic>
+          </wp:inline>
+        </w:drawing>
+      </w:r>
+    </w:p>
+    <w:p>
+      <w:r>
+        <w:lastRenderedPageBreak/>
+        <w:drawing>
+          <wp:inline distT="0" distB="0" distL="0" distR="0" wp14:anchorId="0C2A7FDC" wp14:editId="4EBD08B8">
+            <wp:extent cx="5731510" cy="3208020"/>
+            <wp:effectExtent l="0" t="0" r="2540" b="0"/>
+            <wp:docPr id="1336604716" name="Picture 1"/>
+            <wp:cNvGraphicFramePr>
+              <a:graphicFrameLocks xmlns:a="http://schemas.openxmlformats.org/drawingml/2006/main" noChangeAspect="1"/>
+            </wp:cNvGraphicFramePr>
+            <a:graphic xmlns:a="http://schemas.openxmlformats.org/drawingml/2006/main">
+              <a:graphicData uri="http://schemas.openxmlformats.org/drawingml/2006/picture">
+                <pic:pic xmlns:pic="http://schemas.openxmlformats.org/drawingml/2006/picture">
+                  <pic:nvPicPr>
+                    <pic:cNvPr id="1336604716" name=""/>
+                    <pic:cNvPicPr/>
+                  </pic:nvPicPr>
+                  <pic:blipFill>
+                    <a:blip r:embed="rId12"/>
+                    <a:stretch>
+                      <a:fillRect/>
+                    </a:stretch>
+                  </pic:blipFill>
+                  <pic:spPr>
+                    <a:xfrm>
+                      <a:off x="0" y="0"/>
+                      <a:ext cx="5731510" cy="3208020"/>
+                    </a:xfrm>
+                    <a:prstGeom prst="rect">
+                      <a:avLst/>
+                    </a:prstGeom>
+                  </pic:spPr>
+                </pic:pic>
+              </a:graphicData>
+            </a:graphic>
+          </wp:inline>
+        </w:drawing>
+      </w:r>
+    </w:p>
+    <w:p>
+      <w:pPr>
+        <w:pStyle w:val="Heading2"/>
+      </w:pPr>
+      <w:r>
+        <w:t>Add album page</w:t>
+      </w:r>
+    </w:p>
+    <w:p>
+      <w:r>
+        <w:drawing>
+          <wp:inline distT="0" distB="0" distL="0" distR="0" wp14:anchorId="4BF20108" wp14:editId="03409FE0">
+            <wp:extent cx="5731510" cy="3221990"/>
+            <wp:effectExtent l="0" t="0" r="2540" b="0"/>
+            <wp:docPr id="650449542" name="Picture 1"/>
+            <wp:cNvGraphicFramePr>
+              <a:graphicFrameLocks xmlns:a="http://schemas.openxmlformats.org/drawingml/2006/main" noChangeAspect="1"/>
+            </wp:cNvGraphicFramePr>
+            <a:graphic xmlns:a="http://schemas.openxmlformats.org/drawingml/2006/main">
+              <a:graphicData uri="http://schemas.openxmlformats.org/drawingml/2006/picture">
+                <pic:pic xmlns:pic="http://schemas.openxmlformats.org/drawingml/2006/picture">
+                  <pic:nvPicPr>
+                    <pic:cNvPr id="650449542" name=""/>
+                    <pic:cNvPicPr/>
+                  </pic:nvPicPr>
+                  <pic:blipFill>
+                    <a:blip r:embed="rId13"/>
+                    <a:stretch>
+                      <a:fillRect/>
+                    </a:stretch>
+                  </pic:blipFill>
+                  <pic:spPr>
+                    <a:xfrm>
+                      <a:off x="0" y="0"/>
+                      <a:ext cx="5731510" cy="3221990"/>
+                    </a:xfrm>
+                    <a:prstGeom prst="rect">
+                      <a:avLst/>
+                    </a:prstGeom>
+                  </pic:spPr>
+                </pic:pic>
+              </a:graphicData>
+            </a:graphic>
+          </wp:inline>
+        </w:drawing>
       </w:r>
     </w:p>
     <w:sectPr>
@@ -487,7 +3128,6 @@
     <w:next w:val="Normal"/>
     <w:link w:val="Heading2Char"/>
     <w:uiPriority w:val="9"/>
-    <w:semiHidden/>
     <w:unhideWhenUsed/>
     <w:qFormat/>
     <w:rsid w:val="008206D4"/>
@@ -704,7 +3344,6 @@
     <w:basedOn w:val="DefaultParagraphFont"/>
     <w:link w:val="Heading2"/>
     <w:uiPriority w:val="9"/>
-    <w:semiHidden/>
     <w:rsid w:val="008206D4"/>
     <w:rPr>
       <w:rFonts w:asciiTheme="majorHAnsi" w:eastAsiaTheme="majorEastAsia" w:hAnsiTheme="majorHAnsi" w:cstheme="majorBidi"/>
@@ -975,6 +3614,25 @@
       <w:color w:val="0F4761" w:themeColor="accent1" w:themeShade="BF"/>
       <w:spacing w:val="5"/>
     </w:rPr>
+  </w:style>
+  <w:style w:type="table" w:styleId="TableGrid">
+    <w:name w:val="Table Grid"/>
+    <w:basedOn w:val="TableNormal"/>
+    <w:uiPriority w:val="39"/>
+    <w:rsid w:val="00E678DF"/>
+    <w:pPr>
+      <w:spacing w:after="0" w:line="240" w:lineRule="auto"/>
+    </w:pPr>
+    <w:tblPr>
+      <w:tblBorders>
+        <w:top w:val="single" w:sz="4" w:space="0" w:color="auto"/>
+        <w:left w:val="single" w:sz="4" w:space="0" w:color="auto"/>
+        <w:bottom w:val="single" w:sz="4" w:space="0" w:color="auto"/>
+        <w:right w:val="single" w:sz="4" w:space="0" w:color="auto"/>
+        <w:insideH w:val="single" w:sz="4" w:space="0" w:color="auto"/>
+        <w:insideV w:val="single" w:sz="4" w:space="0" w:color="auto"/>
+      </w:tblBorders>
+    </w:tblPr>
   </w:style>
 </w:styles>
 </file>
@@ -1292,4 +3950,34 @@
     </a:ext>
   </a:extLst>
 </a:theme>
+</file>
+
+<file path=customXml/item1.xml><?xml version="1.0" encoding="utf-8"?>
+<b:Sources xmlns:b="http://schemas.openxmlformats.org/officeDocument/2006/bibliography" xmlns="http://schemas.openxmlformats.org/officeDocument/2006/bibliography" SelectedStyle="\APASixthEditionOfficeOnline.xsl" StyleName="APA" Version="6">
+  <b:Source>
+    <b:Tag>Dja26</b:Tag>
+    <b:SourceType>DocumentFromInternetSite</b:SourceType>
+    <b:Guid>{67CC0705-0D21-4055-97FF-A7CD4B720F78}</b:Guid>
+    <b:Title>Documentation</b:Title>
+    <b:Year>2026</b:Year>
+    <b:Month>03</b:Month>
+    <b:Day>16</b:Day>
+    <b:Author>
+      <b:Author>
+        <b:Corporate>Django Software Foundation</b:Corporate>
+      </b:Author>
+    </b:Author>
+    <b:InternetSiteTitle>Django</b:InternetSiteTitle>
+    <b:URL>https://docs.djangoproject.com/en/6.0/topics/security/#:~:text=Django%27s%20querysets%20are%20protected%20from,separately%20from%20the%20query%27s%20parameters.</b:URL>
+    <b:RefOrder>1</b:RefOrder>
+  </b:Source>
+</b:Sources>
+</file>
+
+<file path=customXml/itemProps1.xml><?xml version="1.0" encoding="utf-8"?>
+<ds:datastoreItem xmlns:ds="http://schemas.openxmlformats.org/officeDocument/2006/customXml" ds:itemID="{C8E0C94A-9CC1-4B6E-93F2-C88DD4C5D19A}">
+  <ds:schemaRefs>
+    <ds:schemaRef ds:uri="http://schemas.openxmlformats.org/officeDocument/2006/bibliography"/>
+  </ds:schemaRefs>
+</ds:datastoreItem>
 </file>
</xml_diff>